<commit_message>
Put relocation/remote availability on its own line under the headline
Headlines over the length limit used to lose their last " | " segment
(e.g. "Willing to relocate to Bucharest") in Python. Now text over a
limit always goes back to Claude for a repair, and availability lives
in profile.json preferences.availability: id'd lines Claude picks per JD
(availability_ids) and assemble() copies verbatim into an optional
`availability` field, rendered under the headline with its own one-line
limit. validate() checks it matches the profile lines and that the
headline doesn't repeat them. The template's {%p if availability %}
paragraphs vanish when it's absent, so generate.py output is unchanged.

Co-Authored-By: Claude Opus 5.5 <noreply@anthropic.com>
</commit_message>
<xml_diff>
--- a/templates/cv_template_with_summary.docx
+++ b/templates/cv_template_with_summary.docx
@@ -54,6 +54,57 @@
           <w:rtl w:val="0"/>
         </w:rPr>
         <w:t xml:space="preserve"> }}</w:t>
+      </w:r>
+    </w:p>
+    <w:p>
+      <w:pPr>
+        <w:widowControl w:val="0"/>
+        <w:spacing w:line="256" w:lineRule="auto"/>
+        <w:jc w:val="center"/>
+        <w:rPr>
+          <w:rFonts w:ascii="Calibri" w:hAnsi="Calibri" w:eastAsia="Calibri" w:cs="Calibri"/>
+        </w:rPr>
+      </w:pPr>
+      <w:r>
+        <w:rPr>
+          <w:rFonts w:ascii="Calibri" w:hAnsi="Calibri" w:eastAsia="Calibri" w:cs="Calibri"/>
+          <w:rtl w:val="0"/>
+        </w:rPr>
+        <w:t xml:space="preserve">{%p if availability %}</w:t>
+      </w:r>
+    </w:p>
+    <w:p>
+      <w:pPr>
+        <w:widowControl w:val="0"/>
+        <w:spacing w:line="256" w:lineRule="auto"/>
+        <w:jc w:val="center"/>
+        <w:rPr>
+          <w:rFonts w:ascii="Calibri" w:hAnsi="Calibri" w:eastAsia="Calibri" w:cs="Calibri"/>
+        </w:rPr>
+      </w:pPr>
+      <w:r>
+        <w:rPr>
+          <w:rFonts w:ascii="Calibri" w:hAnsi="Calibri" w:eastAsia="Calibri" w:cs="Calibri"/>
+          <w:rtl w:val="0"/>
+        </w:rPr>
+        <w:t xml:space="preserve">{{ availability }}</w:t>
+      </w:r>
+    </w:p>
+    <w:p>
+      <w:pPr>
+        <w:widowControl w:val="0"/>
+        <w:spacing w:line="256" w:lineRule="auto"/>
+        <w:jc w:val="center"/>
+        <w:rPr>
+          <w:rFonts w:ascii="Calibri" w:hAnsi="Calibri" w:eastAsia="Calibri" w:cs="Calibri"/>
+        </w:rPr>
+      </w:pPr>
+      <w:r>
+        <w:rPr>
+          <w:rFonts w:ascii="Calibri" w:hAnsi="Calibri" w:eastAsia="Calibri" w:cs="Calibri"/>
+          <w:rtl w:val="0"/>
+        </w:rPr>
+        <w:t xml:space="preserve">{%p endif %}</w:t>
       </w:r>
     </w:p>
     <w:p>

</xml_diff>